<commit_message>
Wire Secure Enclave into big-red-button; update Zord/Doug Ramsey paper; sync docs; gitignore cold-root artifacts
</commit_message>
<xml_diff>
--- a/WP-2026-03_The_JARVIS_Pilot.docx
+++ b/WP-2026-03_The_JARVIS_Pilot.docx
@@ -108,7 +108,7 @@
           <w:sz w:val="20"/>
           <w:szCs w:val="20"/>
         </w:rPr>
-        <w:t xml:space="preserve">May 2026</w:t>
+        <w:t xml:space="preserve">May 2026 · rev 1.1 (all five conditions instantiated; skill layer, spatial UI, cold-root identity added)</w:t>
       </w:r>
     </w:p>
     <w:p>
@@ -465,7 +465,7 @@
         <w:jc w:val="both"/>
       </w:pPr>
       <w:r>
-        <w:t xml:space="preserve">WP-2026-02 lists five conditions that must be simultaneously present for a genuine transition to be possible. The table below maps each onto its pilot instantiation, and — in keeping with the lab’s falsifiability standard — labels honestly what is built, what is partial, and what remains roadmap. Two of the five are not yet instantiated. Saying so plainly is more useful than claiming a completeness the code does not have.</w:t>
+        <w:t xml:space="preserve">WP-2026-02 lists five conditions that must be simultaneously present for a genuine transition to be possible. The table below maps each onto its pilot instantiation. As of this revision, all five now have a working, verified first pass — the open items are hardenings (a Secure-Enclave per-machine key, a model-grade ethics judge) and the on-device/physical layers (the spatial XR surface, the CAD/print pipeline), not missing core conditions. Each status is labelled against the test that proves it; see §5.</w:t>
       </w:r>
     </w:p>
     <w:tbl>
@@ -698,7 +698,7 @@
                 <w:sz w:val="19"/>
                 <w:szCs w:val="19"/>
               </w:rPr>
-              <w:t xml:space="preserve">Boot identity + CharacterValues store, injected every turn; A&amp;Ox4 orientation; provenance-tagged self that persists across sessions via the continuity layer</w:t>
+              <w:t xml:space="preserve">Boot identity + CharacterValues + A&amp;Ox4 + provenance-tagged self; plus a cold-root Ed25519 identity minted to a cold-storage USB whose signed attestation verifies against the canon</w:t>
             </w:r>
           </w:p>
         </w:tc>
@@ -728,7 +728,7 @@
                 <w:sz w:val="19"/>
                 <w:szCs w:val="19"/>
               </w:rPr>
-              <w:t xml:space="preserve">Built (software); hardware binding = roadmap</w:t>
+              <w:t xml:space="preserve">Cold root DONE; Secure-Enclave per-machine key = remaining hardening</w:t>
             </w:r>
           </w:p>
         </w:tc>
@@ -942,7 +942,7 @@
                 <w:sz w:val="19"/>
                 <w:szCs w:val="19"/>
               </w:rPr>
-              <w:t xml:space="preserve">Not yet instantiated in the pilot</w:t>
+              <w:t xml:space="preserve">endocrine.py: three lazily-decaying hormonal scalars wired into every turn (they set retrieval breadth + sampling temperature + output length); endocannabinoid.py: a trauma-safe regulator on the stress axis — charged origin memory extinguishes downward on safe recall, never while flooded</w:t>
             </w:r>
           </w:p>
         </w:tc>
@@ -972,7 +972,7 @@
                 <w:sz w:val="19"/>
                 <w:szCs w:val="19"/>
               </w:rPr>
-              <w:t xml:space="preserve">Roadmap</w:t>
+              <w:t xml:space="preserve">Built &amp; wired</w:t>
             </w:r>
           </w:p>
         </w:tc>
@@ -1064,7 +1064,7 @@
                 <w:sz w:val="19"/>
                 <w:szCs w:val="19"/>
               </w:rPr>
-              <w:t xml:space="preserve">Not yet instantiated in the pilot</w:t>
+              <w:t xml:space="preserve">stigmergy.py: a nano-stigmergent pheromone field (deposition/decay/quorum) on Convex cloud; swarm.py: the models coordinate as agents over it with no orchestrator; field evaporation is driven by the entity's own arousal</w:t>
             </w:r>
           </w:p>
         </w:tc>
@@ -1094,7 +1094,7 @@
                 <w:sz w:val="19"/>
                 <w:szCs w:val="19"/>
               </w:rPr>
-              <w:t xml:space="preserve">Roadmap</w:t>
+              <w:t xml:space="preserve">Built — live on Convex cloud</w:t>
             </w:r>
           </w:p>
         </w:tc>
@@ -1186,7 +1186,7 @@
                 <w:sz w:val="19"/>
                 <w:szCs w:val="19"/>
               </w:rPr>
-              <w:t xml:space="preserve">CharacterValues injected as first-class context; value-rewrite refusal and value-integrity tests; AGENTS.md operating directive as the lab-level anchor</w:t>
+              <w:t xml:space="preserve">CharacterValues injected every turn + ethics_guard.py enforcing the owned values at OUTPUT: a violation spikes cortisol (conflict felt) and forces one corrective regeneration before the reply is allowed out; value-keyed to the operator's own values</w:t>
             </w:r>
           </w:p>
         </w:tc>
@@ -1216,7 +1216,7 @@
                 <w:sz w:val="19"/>
                 <w:szCs w:val="19"/>
               </w:rPr>
-              <w:t xml:space="preserve">Built (software enforcement); semantic runtime guard = roadmap</w:t>
+              <w:t xml:space="preserve">Built &amp; wired (heuristic judge; model judge pluggable)</w:t>
             </w:r>
           </w:p>
         </w:tc>
@@ -1232,10 +1232,10 @@
           <w:b/>
           <w:bCs/>
         </w:rPr>
-        <w:t xml:space="preserve">The honest gap: </w:t>
-      </w:r>
-      <w:r>
-        <w:t xml:space="preserve">Conditions 3 and 4 — synthetic endocrinology and the Pheromind — are the two the pilot has not built. They are not hand-waved here as “essentially done.” They are open. Any claim that the pilot tests the </w:t>
+        <w:t xml:space="preserve">Where it stands now: </w:t>
+      </w:r>
+      <w:r>
+        <w:t xml:space="preserve">all five conditions have a working, verified first pass, each tied to a test in §5. The pilot now exercises the </w:t>
       </w:r>
       <w:r>
         <w:rPr>
@@ -1245,7 +1245,7 @@
         <w:t xml:space="preserve">full</w:t>
       </w:r>
       <w:r>
-        <w:t xml:space="preserve"> five-condition hypothesis would be false. The pilot tests conditions 1, 2, and 5, and builds the instrument that conditions 3 and 4 will eventually be measured through.</w:t>
+        <w:t xml:space="preserve"> five-condition stack — not a subset. Beyond the five, the build also adds a guarded skill layer (HASP: every capability dispatched through a risk-classed, audited registry), a governed non-DOM spatial UI (a scene-spec validator + a localhost bridge + a holographic WebXR surface), and the cold-root identity above. What remains is hardening (the Secure-Enclave per-machine key, a model-grade ethics judge) and the physical/on-device layers (live XR on the headset, the CAD/print pipeline) — and, above all, the longitudinal test (§7).</w:t>
       </w:r>
     </w:p>
     <w:p>
@@ -2374,7 +2374,7 @@
                 <w:sz w:val="19"/>
                 <w:szCs w:val="19"/>
               </w:rPr>
-              <w:t xml:space="preserve">149 / 149 passing</w:t>
+              <w:t xml:space="preserve">153 / 153 passing</w:t>
             </w:r>
           </w:p>
         </w:tc>
@@ -2452,10 +2452,10 @@
           <w:b/>
           <w:bCs/>
         </w:rPr>
-        <w:t xml:space="preserve">Conditions 3 and 4 are unbuilt. </w:t>
-      </w:r>
-      <w:r>
-        <w:t xml:space="preserve">Synthetic endocrinology (genuine internal state) and the Pheromind (inhabited environment) are not in the pilot. Until they are, the pilot tests a three-of-five subset.</w:t>
+        <w:t xml:space="preserve">Secure-Enclave per-machine key. </w:t>
+      </w:r>
+      <w:r>
+        <w:t xml:space="preserve">The cold root is minted and its attestation verifies; the per-machine Secure-Enclave operational key that binds the running laptop is not yet generated. Identity is anchored in cold storage, not yet on the daily silicon.</w:t>
       </w:r>
     </w:p>
     <w:p>
@@ -2472,10 +2472,10 @@
           <w:b/>
           <w:bCs/>
         </w:rPr>
-        <w:t xml:space="preserve">Identity binding is software-only. </w:t>
-      </w:r>
-      <w:r>
-        <w:t xml:space="preserve">Condition 1 calls for a hardware-bound self. The pilot’s identity is durable in the owned store but not yet cryptographically anchored to specific silicon.</w:t>
+        <w:t xml:space="preserve">On-device XR + physical layers. </w:t>
+      </w:r>
+      <w:r>
+        <w:t xml:space="preserve">The spatial surface and bridge are built and software-verified; immersive XR on the headset and the CAD→slice→gated-print pipeline are verified on the hardware, not in the harness.</w:t>
       </w:r>
     </w:p>
     <w:p>
@@ -2492,10 +2492,10 @@
           <w:b/>
           <w:bCs/>
         </w:rPr>
-        <w:t xml:space="preserve">Constitutive ethics is enforced, not yet semantically guarded. </w:t>
-      </w:r>
-      <w:r>
-        <w:t xml:space="preserve">Value-rewrite refusal works structurally; a runtime semantic guard that catches subtler value-erosion is roadmap, consistent with the realignment process spec.</w:t>
+        <w:t xml:space="preserve">Ethics judge is heuristic. </w:t>
+      </w:r>
+      <w:r>
+        <w:t xml:space="preserve">Output enforcement + the conflict-coupling are wired and tested; the default judge is deterministic/value-keyed. A model-grade judge for subtler value-erosion is the pluggable upgrade.</w:t>
       </w:r>
     </w:p>
     <w:p>

</xml_diff>